<commit_message>
docs(verification): record final submission regression
</commit_message>
<xml_diff>
--- a/submission/CjRepoMesh-official-form-draft-2026-09-26.docx
+++ b/submission/CjRepoMesh-official-form-draft-2026-09-26.docx
@@ -1165,7 +1165,7 @@
           <w:sz w:val="22"/>
           <w:color w:val="000000"/>
         </w:rPr>
-        <w:t>1. 技术可行性：仓颉原生服务端和增强版 cjpm 已构建并通过 Linux 四组核心回归。公开代码提交 31567a61 上四组 4/4、230.19 秒；加入 Unix 换行约束后的干净检出 6c4dbc8a 上再次 4/4、230.47 秒，两轮之后均核对 Docker Doctor 九项与 Overall PASS。</w:t>
+        <w:t>1. 技术可行性：仓颉原生服务端和增强版 cjpm 已构建并通过 Linux 四组核心回归。2026 年 9 月 26 日，本地交付材料提交 98e9f849 真实重编译服务端并运行四组，4/4 PASS、252.01 秒，随后 Docker Doctor 九项与 Overall PASS。该提交只改文档与官方表格草稿，产品代码与已验证版本相同；当前 AtomGit 与 GitHub 的公开 main 仍为 8cd4a821，两边匿名检出均成功。</w:t>
       </w:r>
     </w:p>
     <w:p>
@@ -1195,7 +1195,7 @@
           <w:sz w:val="22"/>
           <w:color w:val="000000"/>
         </w:rPr>
-        <w:t>3. 开发进度规划：四项技术交付已有实现及本地证据。2026 年 9 月 26 日，AtomGit 与 GitHub 的公开 main 均为仅增加验证文档的 8cd4a821，两边匿名检出成功。提交前仍需完成正式演示视频、个人信息、签字、PDF 转换和平台提交；后续优先扩充官方 HLT/LLT、补足合法签名 Windows SDK 复测，并增加持久化同步游标、断点续传、多实例协调与生产审计。</w:t>
+        <w:t>3. 开发进度规划：四项技术交付已有实现及本地证据，本地交付材料提交 98e9f849 已完成 Linux 四组和 Docker Doctor 复核。提交前仍需由参赛者补齐身份、联系方式、正式视频链接和签字，生成最终 PDF，并把最终提交同步到公开仓后再次匿名核验。后续优先扩充官方 HLT/LLT、补足合法签名 Windows SDK 复测，并增加持久化同步游标、断点续传、多实例协调与生产审计。</w:t>
       </w:r>
     </w:p>
     <w:p>

</xml_diff>